<commit_message>
Updated hackathon details: changed date to 11 October 2025, team size to 3, removed AI usage, updated prizes
</commit_message>
<xml_diff>
--- a/docs/first-hackathon-details.docx
+++ b/docs/first-hackathon-details.docx
@@ -20,26 +20,15 @@
     </w:p>
     <w:p>
       <w:r>
-        <w:t xml:space="preserve">Stellenbosch campus of </w:t>
-      </w:r>
-      <w:proofErr w:type="spellStart"/>
-      <w:r>
-        <w:t>Belgiumcampus</w:t>
-      </w:r>
-      <w:proofErr w:type="spellEnd"/>
+        <w:t>Stellenbosch campus of Belgiumcampus</w:t>
+      </w:r>
     </w:p>
     <w:p>
       <w:r>
-        <w:t>13</w:t>
-      </w:r>
-      <w:r>
-        <w:rPr>
-          <w:vertAlign w:val="superscript"/>
-        </w:rPr>
-        <w:t>th</w:t>
-      </w:r>
-      <w:r>
-        <w:t xml:space="preserve"> September 08:00 – 20:00</w:t>
+        <w:t>11 October</w:t>
+      </w:r>
+      <w:r>
+        <w:t xml:space="preserve"> 08:00 – 20:00</w:t>
       </w:r>
     </w:p>
     <w:p>
@@ -272,69 +261,8 @@
                   <w14:round/>
                 </w14:textOutline>
               </w:rPr>
-              <w:t xml:space="preserve">Topic explanation and </w:t>
-            </w:r>
-            <w:proofErr w:type="gramStart"/>
-            <w:r>
-              <w:rPr>
-                <w:rFonts w:asciiTheme="minorBidi" w:hAnsiTheme="minorBidi" w:cstheme="minorBidi"/>
-                <w:color w:val="000000" w:themeColor="text1"/>
-                <w:sz w:val="24"/>
-                <w:szCs w:val="24"/>
-                <w14:shadow w14:blurRad="38100" w14:dist="19050" w14:dir="2700000" w14:sx="100000" w14:sy="100000" w14:kx="0" w14:ky="0" w14:algn="tl">
-                  <w14:schemeClr w14:val="dk1">
-                    <w14:alpha w14:val="60000"/>
-                  </w14:schemeClr>
-                </w14:shadow>
-                <w14:textOutline w14:w="0" w14:cap="flat" w14:cmpd="sng" w14:algn="ctr">
-                  <w14:noFill/>
-                  <w14:prstDash w14:val="solid"/>
-                  <w14:round/>
-                </w14:textOutline>
-              </w:rPr>
-              <w:t>Idealization( Explaining</w:t>
-            </w:r>
-            <w:proofErr w:type="gramEnd"/>
-            <w:r>
-              <w:rPr>
-                <w:rFonts w:asciiTheme="minorBidi" w:hAnsiTheme="minorBidi" w:cstheme="minorBidi"/>
-                <w:color w:val="000000" w:themeColor="text1"/>
-                <w:sz w:val="24"/>
-                <w:szCs w:val="24"/>
-                <w14:shadow w14:blurRad="38100" w14:dist="19050" w14:dir="2700000" w14:sx="100000" w14:sy="100000" w14:kx="0" w14:ky="0" w14:algn="tl">
-                  <w14:schemeClr w14:val="dk1">
-                    <w14:alpha w14:val="60000"/>
-                  </w14:schemeClr>
-                </w14:shadow>
-                <w14:textOutline w14:w="0" w14:cap="flat" w14:cmpd="sng" w14:algn="ctr">
-                  <w14:noFill/>
-                  <w14:prstDash w14:val="solid"/>
-                  <w14:round/>
-                </w14:textOutline>
-              </w:rPr>
-              <w:t xml:space="preserve"> idealization, giving </w:t>
-            </w:r>
-            <w:proofErr w:type="gramStart"/>
-            <w:r>
-              <w:rPr>
-                <w:rFonts w:asciiTheme="minorBidi" w:hAnsiTheme="minorBidi" w:cstheme="minorBidi"/>
-                <w:color w:val="000000" w:themeColor="text1"/>
-                <w:sz w:val="24"/>
-                <w:szCs w:val="24"/>
-                <w14:shadow w14:blurRad="38100" w14:dist="19050" w14:dir="2700000" w14:sx="100000" w14:sy="100000" w14:kx="0" w14:ky="0" w14:algn="tl">
-                  <w14:schemeClr w14:val="dk1">
-                    <w14:alpha w14:val="60000"/>
-                  </w14:schemeClr>
-                </w14:shadow>
-                <w14:textOutline w14:w="0" w14:cap="flat" w14:cmpd="sng" w14:algn="ctr">
-                  <w14:noFill/>
-                  <w14:prstDash w14:val="solid"/>
-                  <w14:round/>
-                </w14:textOutline>
-              </w:rPr>
-              <w:t>examples )</w:t>
-            </w:r>
-            <w:proofErr w:type="gramEnd"/>
+              <w:t>Topic explanation and Idealization( Explaining idealization, giving examples )</w:t>
+            </w:r>
           </w:p>
         </w:tc>
       </w:tr>
@@ -739,7 +667,7 @@
                   <w14:round/>
                 </w14:textOutline>
               </w:rPr>
-              <w:t>3D Printing/ Lazer cutting time</w:t>
+              <w:t>IOT Arduino explanation</w:t>
             </w:r>
           </w:p>
         </w:tc>
@@ -1186,47 +1114,7 @@
                   <w14:round/>
                 </w14:textOutline>
               </w:rPr>
-              <w:t xml:space="preserve">Presentation on </w:t>
-            </w:r>
-            <w:proofErr w:type="gramStart"/>
-            <w:r>
-              <w:rPr>
-                <w:rFonts w:asciiTheme="minorBidi" w:hAnsiTheme="minorBidi" w:cstheme="minorBidi"/>
-                <w:color w:val="000000" w:themeColor="text1"/>
-                <w:sz w:val="24"/>
-                <w:szCs w:val="24"/>
-                <w14:shadow w14:blurRad="38100" w14:dist="19050" w14:dir="2700000" w14:sx="100000" w14:sy="100000" w14:kx="0" w14:ky="0" w14:algn="tl">
-                  <w14:schemeClr w14:val="dk1">
-                    <w14:alpha w14:val="60000"/>
-                  </w14:schemeClr>
-                </w14:shadow>
-                <w14:textOutline w14:w="0" w14:cap="flat" w14:cmpd="sng" w14:algn="ctr">
-                  <w14:noFill/>
-                  <w14:prstDash w14:val="solid"/>
-                  <w14:round/>
-                </w14:textOutline>
-              </w:rPr>
-              <w:t>Drones(</w:t>
-            </w:r>
-            <w:proofErr w:type="gramEnd"/>
-            <w:r>
-              <w:rPr>
-                <w:rFonts w:asciiTheme="minorBidi" w:hAnsiTheme="minorBidi" w:cstheme="minorBidi"/>
-                <w:color w:val="000000" w:themeColor="text1"/>
-                <w:sz w:val="24"/>
-                <w:szCs w:val="24"/>
-                <w14:shadow w14:blurRad="38100" w14:dist="19050" w14:dir="2700000" w14:sx="100000" w14:sy="100000" w14:kx="0" w14:ky="0" w14:algn="tl">
-                  <w14:schemeClr w14:val="dk1">
-                    <w14:alpha w14:val="60000"/>
-                  </w14:schemeClr>
-                </w14:shadow>
-                <w14:textOutline w14:w="0" w14:cap="flat" w14:cmpd="sng" w14:algn="ctr">
-                  <w14:noFill/>
-                  <w14:prstDash w14:val="solid"/>
-                  <w14:round/>
-                </w14:textOutline>
-              </w:rPr>
-              <w:t>Provided by Philip or Nick ideally)</w:t>
+              <w:t>3D Printing/ Lazer cutting time</w:t>
             </w:r>
           </w:p>
         </w:tc>
@@ -1594,7 +1482,7 @@
                   <w14:round/>
                 </w14:textOutline>
               </w:rPr>
-              <w:t>Prizes and winners announced</w:t>
+              <w:t>Judges start grading process and if done winners announced</w:t>
             </w:r>
           </w:p>
         </w:tc>
@@ -1627,7 +1515,7 @@
         </w:numPr>
       </w:pPr>
       <w:r>
-        <w:t>Groups of 3-5 or solo development</w:t>
+        <w:t>Groups of 3</w:t>
       </w:r>
     </w:p>
     <w:p>
@@ -1639,7 +1527,7 @@
         </w:numPr>
       </w:pPr>
       <w:r>
-        <w:t>Ai may not be used, except in the dedicated research time or when building own AI for project</w:t>
+        <w:t>Moderators will walk around to ensure groups are not cheating (All willing CLC members)</w:t>
       </w:r>
     </w:p>
     <w:p>
@@ -1651,7 +1539,7 @@
         </w:numPr>
       </w:pPr>
       <w:r>
-        <w:t>Moderators will walk around to ensure groups are not cheating (All willing CLC members)</w:t>
+        <w:t>Anything in the technoLab may be used in the project</w:t>
       </w:r>
     </w:p>
     <w:p>
@@ -1663,26 +1551,6 @@
         </w:numPr>
       </w:pPr>
       <w:r>
-        <w:t xml:space="preserve">Anything in the </w:t>
-      </w:r>
-      <w:proofErr w:type="spellStart"/>
-      <w:r>
-        <w:t>technoLab</w:t>
-      </w:r>
-      <w:proofErr w:type="spellEnd"/>
-      <w:r>
-        <w:t xml:space="preserve"> may be used in the project</w:t>
-      </w:r>
-    </w:p>
-    <w:p>
-      <w:pPr>
-        <w:pStyle w:val="ListParagraph"/>
-        <w:numPr>
-          <w:ilvl w:val="0"/>
-          <w:numId w:val="1"/>
-        </w:numPr>
-      </w:pPr>
-      <w:r>
         <w:t>AI may not be used</w:t>
       </w:r>
     </w:p>
@@ -1696,75 +1564,18 @@
     </w:p>
     <w:p>
       <w:r>
-        <w:t xml:space="preserve">The best 3 projects will all receive </w:t>
-      </w:r>
-      <w:proofErr w:type="gramStart"/>
-      <w:r>
-        <w:t>prizes(</w:t>
-      </w:r>
-      <w:proofErr w:type="gramEnd"/>
-      <w:r>
-        <w:t>will be determined later what prizes)</w:t>
-      </w:r>
-    </w:p>
-    <w:p>
-      <w:r>
-        <w:t>The judges favourite project will receive an additional prize (Whether it be tools implemented or certain pieces of code)</w:t>
-      </w:r>
-    </w:p>
-    <w:p>
-      <w:r>
-        <w:t xml:space="preserve">The project that uses the most “out- of syllabus” tools will get a prize </w:t>
-      </w:r>
-      <w:proofErr w:type="spellStart"/>
-      <w:r>
-        <w:t>aswell</w:t>
-      </w:r>
-      <w:proofErr w:type="spellEnd"/>
-    </w:p>
-    <w:p/>
-    <w:p>
-      <w:pPr>
-        <w:pStyle w:val="Heading1"/>
-      </w:pPr>
+        <w:t>The best 3 projects will all receive prizes(will be determined later what prizes)</w:t>
+      </w:r>
     </w:p>
     <w:p>
       <w:pPr>
         <w:pStyle w:val="Heading1"/>
       </w:pPr>
       <w:r>
-        <w:t>Hackathon Ideas</w:t>
-      </w:r>
-    </w:p>
-    <w:p>
-      <w:pPr>
-        <w:rPr>
-          <w:b/>
-          <w:bCs/>
-        </w:rPr>
-      </w:pPr>
-      <w:r>
-        <w:rPr>
-          <w:b/>
-          <w:bCs/>
-        </w:rPr>
-        <w:t xml:space="preserve">Student can </w:t>
-      </w:r>
-      <w:proofErr w:type="gramStart"/>
-      <w:r>
-        <w:rPr>
-          <w:b/>
-          <w:bCs/>
-        </w:rPr>
-        <w:t>chose</w:t>
-      </w:r>
-      <w:proofErr w:type="gramEnd"/>
-      <w:r>
-        <w:rPr>
-          <w:b/>
-          <w:bCs/>
-        </w:rPr>
-        <w:t xml:space="preserve"> one of the following topics to attempts</w:t>
+        <w:t xml:space="preserve">Hackathon </w:t>
+      </w:r>
+      <w:r>
+        <w:t>Theme</w:t>
       </w:r>
     </w:p>
     <w:p>
@@ -1772,94 +1583,62 @@
         <w:pStyle w:val="Heading2"/>
       </w:pPr>
       <w:r>
-        <w:t>Energy saving house</w:t>
+        <w:t>Puzzle box</w:t>
       </w:r>
     </w:p>
     <w:p>
       <w:r>
-        <w:t xml:space="preserve">Sensors should detect how someone is moving around in a house and only switch on the lights in the room with people and 1 surrounding room (if students want to do </w:t>
-      </w:r>
-      <w:proofErr w:type="gramStart"/>
-      <w:r>
-        <w:t>extra</w:t>
-      </w:r>
-      <w:proofErr w:type="gramEnd"/>
-      <w:r>
-        <w:t xml:space="preserve"> they can create a menu to ask how many adjacent rooms should light up to the customer)</w:t>
+        <w:t>Student dev</w:t>
+      </w:r>
+      <w:r>
+        <w:t xml:space="preserve">elop a puzzle box where they set challenges </w:t>
+      </w:r>
+      <w:r>
+        <w:t>and differ</w:t>
+      </w:r>
+      <w:r>
+        <w:t>ent rooms with challenges for the user to solve.</w:t>
+      </w:r>
+    </w:p>
+    <w:p>
+      <w:r>
+        <w:t>The puzzle box should act as an escape room, where once on puzzle is solved a new challenge appears. Students can build a website</w:t>
+      </w:r>
+      <w:r>
+        <w:t xml:space="preserve"> or</w:t>
+      </w:r>
+      <w:r>
+        <w:t xml:space="preserve"> a console App </w:t>
+      </w:r>
+      <w:r>
+        <w:t xml:space="preserve">combined the IOT(Arduino) </w:t>
+      </w:r>
+      <w:r>
+        <w:t>to build this puzzle.</w:t>
+      </w:r>
+      <w:r>
+        <w:t xml:space="preserve"> </w:t>
       </w:r>
     </w:p>
     <w:p/>
     <w:p>
-      <w:pPr>
-        <w:pStyle w:val="Heading2"/>
-      </w:pPr>
-      <w:r>
-        <w:t>Smart Door Lock</w:t>
+      <w:r>
+        <w:t xml:space="preserve">Think Keep Talking and nobody explodes, where in the game there is a bomb with different challenges. In the hackathon students will </w:t>
+      </w:r>
+      <w:r>
+        <w:t>create a room setup like the game</w:t>
       </w:r>
     </w:p>
     <w:p>
       <w:r>
-        <w:t xml:space="preserve">A sensor should detect when a user approaches a door and </w:t>
-      </w:r>
-      <w:proofErr w:type="gramStart"/>
-      <w:r>
-        <w:t>start</w:t>
-      </w:r>
-      <w:proofErr w:type="gramEnd"/>
-      <w:r>
-        <w:t xml:space="preserve"> a “login” process which includes:</w:t>
-      </w:r>
-      <w:r>
-        <w:br/>
-        <w:t>1. Monitoring how the user walks (optional)</w:t>
-      </w:r>
-    </w:p>
-    <w:p>
-      <w:r>
-        <w:t>2. Voice recognition</w:t>
-      </w:r>
-    </w:p>
-    <w:p>
-      <w:r>
-        <w:t>3. Fingerprints (as the touch the door handle)</w:t>
-      </w:r>
-    </w:p>
-    <w:p>
-      <w:r>
-        <w:t xml:space="preserve">4. </w:t>
-      </w:r>
-      <w:proofErr w:type="spellStart"/>
-      <w:r>
-        <w:t>Retna</w:t>
-      </w:r>
-      <w:proofErr w:type="spellEnd"/>
-      <w:r>
-        <w:t xml:space="preserve"> Scanner</w:t>
-      </w:r>
-    </w:p>
-    <w:p/>
-    <w:p>
-      <w:pPr>
-        <w:pStyle w:val="Heading2"/>
-      </w:pPr>
-      <w:r>
-        <w:t>Smart Parking</w:t>
-      </w:r>
-    </w:p>
-    <w:p>
-      <w:r>
-        <w:t xml:space="preserve">Students should build a system to help customers find parking, this could include a system where each parking bay has a sensor and when the users enter the parking lot an LED pathway </w:t>
-      </w:r>
-      <w:r>
-        <w:lastRenderedPageBreak/>
-        <w:t>appears in the road guiding them to the designated parking (a system could be used that when a customer steals a parking spot for some reason, a new route should appear)</w:t>
-      </w:r>
-    </w:p>
-    <w:p/>
-    <w:p>
-      <w:pPr>
-        <w:pStyle w:val="Heading2"/>
-      </w:pPr>
+        <w:t xml:space="preserve">Students can build a console app, </w:t>
+      </w:r>
+      <w:r>
+        <w:t xml:space="preserve">website and/or </w:t>
+      </w:r>
+      <w:r>
+        <w:t>use IOT such as Arduino chips</w:t>
+      </w:r>
     </w:p>
     <w:p/>
     <w:sectPr>

</xml_diff>

<commit_message>
Additional improvements: CSS updates, JS enhancements, and test files
</commit_message>
<xml_diff>
--- a/docs/first-hackathon-details.docx
+++ b/docs/first-hackathon-details.docx
@@ -20,15 +20,26 @@
     </w:p>
     <w:p>
       <w:r>
-        <w:t>Stellenbosch campus of Belgiumcampus</w:t>
-      </w:r>
+        <w:t xml:space="preserve">Stellenbosch campus of </w:t>
+      </w:r>
+      <w:proofErr w:type="spellStart"/>
+      <w:r>
+        <w:t>Belgiumcampus</w:t>
+      </w:r>
+      <w:proofErr w:type="spellEnd"/>
     </w:p>
     <w:p>
       <w:r>
-        <w:t>11 October</w:t>
-      </w:r>
-      <w:r>
-        <w:t xml:space="preserve"> 08:00 – 20:00</w:t>
+        <w:t>13</w:t>
+      </w:r>
+      <w:r>
+        <w:rPr>
+          <w:vertAlign w:val="superscript"/>
+        </w:rPr>
+        <w:t>th</w:t>
+      </w:r>
+      <w:r>
+        <w:t xml:space="preserve"> September 08:00 – 20:00</w:t>
       </w:r>
     </w:p>
     <w:p>
@@ -261,8 +272,69 @@
                   <w14:round/>
                 </w14:textOutline>
               </w:rPr>
-              <w:t>Topic explanation and Idealization( Explaining idealization, giving examples )</w:t>
-            </w:r>
+              <w:t xml:space="preserve">Topic explanation and </w:t>
+            </w:r>
+            <w:proofErr w:type="gramStart"/>
+            <w:r>
+              <w:rPr>
+                <w:rFonts w:asciiTheme="minorBidi" w:hAnsiTheme="minorBidi" w:cstheme="minorBidi"/>
+                <w:color w:val="000000" w:themeColor="text1"/>
+                <w:sz w:val="24"/>
+                <w:szCs w:val="24"/>
+                <w14:shadow w14:blurRad="38100" w14:dist="19050" w14:dir="2700000" w14:sx="100000" w14:sy="100000" w14:kx="0" w14:ky="0" w14:algn="tl">
+                  <w14:schemeClr w14:val="dk1">
+                    <w14:alpha w14:val="60000"/>
+                  </w14:schemeClr>
+                </w14:shadow>
+                <w14:textOutline w14:w="0" w14:cap="flat" w14:cmpd="sng" w14:algn="ctr">
+                  <w14:noFill/>
+                  <w14:prstDash w14:val="solid"/>
+                  <w14:round/>
+                </w14:textOutline>
+              </w:rPr>
+              <w:t>Idealization( Explaining</w:t>
+            </w:r>
+            <w:proofErr w:type="gramEnd"/>
+            <w:r>
+              <w:rPr>
+                <w:rFonts w:asciiTheme="minorBidi" w:hAnsiTheme="minorBidi" w:cstheme="minorBidi"/>
+                <w:color w:val="000000" w:themeColor="text1"/>
+                <w:sz w:val="24"/>
+                <w:szCs w:val="24"/>
+                <w14:shadow w14:blurRad="38100" w14:dist="19050" w14:dir="2700000" w14:sx="100000" w14:sy="100000" w14:kx="0" w14:ky="0" w14:algn="tl">
+                  <w14:schemeClr w14:val="dk1">
+                    <w14:alpha w14:val="60000"/>
+                  </w14:schemeClr>
+                </w14:shadow>
+                <w14:textOutline w14:w="0" w14:cap="flat" w14:cmpd="sng" w14:algn="ctr">
+                  <w14:noFill/>
+                  <w14:prstDash w14:val="solid"/>
+                  <w14:round/>
+                </w14:textOutline>
+              </w:rPr>
+              <w:t xml:space="preserve"> idealization, giving </w:t>
+            </w:r>
+            <w:proofErr w:type="gramStart"/>
+            <w:r>
+              <w:rPr>
+                <w:rFonts w:asciiTheme="minorBidi" w:hAnsiTheme="minorBidi" w:cstheme="minorBidi"/>
+                <w:color w:val="000000" w:themeColor="text1"/>
+                <w:sz w:val="24"/>
+                <w:szCs w:val="24"/>
+                <w14:shadow w14:blurRad="38100" w14:dist="19050" w14:dir="2700000" w14:sx="100000" w14:sy="100000" w14:kx="0" w14:ky="0" w14:algn="tl">
+                  <w14:schemeClr w14:val="dk1">
+                    <w14:alpha w14:val="60000"/>
+                  </w14:schemeClr>
+                </w14:shadow>
+                <w14:textOutline w14:w="0" w14:cap="flat" w14:cmpd="sng" w14:algn="ctr">
+                  <w14:noFill/>
+                  <w14:prstDash w14:val="solid"/>
+                  <w14:round/>
+                </w14:textOutline>
+              </w:rPr>
+              <w:t>examples )</w:t>
+            </w:r>
+            <w:proofErr w:type="gramEnd"/>
           </w:p>
         </w:tc>
       </w:tr>
@@ -667,7 +739,7 @@
                   <w14:round/>
                 </w14:textOutline>
               </w:rPr>
-              <w:t>IOT Arduino explanation</w:t>
+              <w:t>3D Printing/ Lazer cutting time</w:t>
             </w:r>
           </w:p>
         </w:tc>
@@ -1114,7 +1186,47 @@
                   <w14:round/>
                 </w14:textOutline>
               </w:rPr>
-              <w:t>3D Printing/ Lazer cutting time</w:t>
+              <w:t xml:space="preserve">Presentation on </w:t>
+            </w:r>
+            <w:proofErr w:type="gramStart"/>
+            <w:r>
+              <w:rPr>
+                <w:rFonts w:asciiTheme="minorBidi" w:hAnsiTheme="minorBidi" w:cstheme="minorBidi"/>
+                <w:color w:val="000000" w:themeColor="text1"/>
+                <w:sz w:val="24"/>
+                <w:szCs w:val="24"/>
+                <w14:shadow w14:blurRad="38100" w14:dist="19050" w14:dir="2700000" w14:sx="100000" w14:sy="100000" w14:kx="0" w14:ky="0" w14:algn="tl">
+                  <w14:schemeClr w14:val="dk1">
+                    <w14:alpha w14:val="60000"/>
+                  </w14:schemeClr>
+                </w14:shadow>
+                <w14:textOutline w14:w="0" w14:cap="flat" w14:cmpd="sng" w14:algn="ctr">
+                  <w14:noFill/>
+                  <w14:prstDash w14:val="solid"/>
+                  <w14:round/>
+                </w14:textOutline>
+              </w:rPr>
+              <w:t>Drones(</w:t>
+            </w:r>
+            <w:proofErr w:type="gramEnd"/>
+            <w:r>
+              <w:rPr>
+                <w:rFonts w:asciiTheme="minorBidi" w:hAnsiTheme="minorBidi" w:cstheme="minorBidi"/>
+                <w:color w:val="000000" w:themeColor="text1"/>
+                <w:sz w:val="24"/>
+                <w:szCs w:val="24"/>
+                <w14:shadow w14:blurRad="38100" w14:dist="19050" w14:dir="2700000" w14:sx="100000" w14:sy="100000" w14:kx="0" w14:ky="0" w14:algn="tl">
+                  <w14:schemeClr w14:val="dk1">
+                    <w14:alpha w14:val="60000"/>
+                  </w14:schemeClr>
+                </w14:shadow>
+                <w14:textOutline w14:w="0" w14:cap="flat" w14:cmpd="sng" w14:algn="ctr">
+                  <w14:noFill/>
+                  <w14:prstDash w14:val="solid"/>
+                  <w14:round/>
+                </w14:textOutline>
+              </w:rPr>
+              <w:t>Provided by Philip or Nick ideally)</w:t>
             </w:r>
           </w:p>
         </w:tc>
@@ -1482,7 +1594,7 @@
                   <w14:round/>
                 </w14:textOutline>
               </w:rPr>
-              <w:t>Judges start grading process and if done winners announced</w:t>
+              <w:t>Prizes and winners announced</w:t>
             </w:r>
           </w:p>
         </w:tc>
@@ -1515,7 +1627,7 @@
         </w:numPr>
       </w:pPr>
       <w:r>
-        <w:t>Groups of 3</w:t>
+        <w:t>Groups of 3-5 or solo development</w:t>
       </w:r>
     </w:p>
     <w:p>
@@ -1527,7 +1639,7 @@
         </w:numPr>
       </w:pPr>
       <w:r>
-        <w:t>Moderators will walk around to ensure groups are not cheating (All willing CLC members)</w:t>
+        <w:t>Ai may not be used, except in the dedicated research time or when building own AI for project</w:t>
       </w:r>
     </w:p>
     <w:p>
@@ -1539,7 +1651,7 @@
         </w:numPr>
       </w:pPr>
       <w:r>
-        <w:t>Anything in the technoLab may be used in the project</w:t>
+        <w:t>Moderators will walk around to ensure groups are not cheating (All willing CLC members)</w:t>
       </w:r>
     </w:p>
     <w:p>
@@ -1551,6 +1663,26 @@
         </w:numPr>
       </w:pPr>
       <w:r>
+        <w:t xml:space="preserve">Anything in the </w:t>
+      </w:r>
+      <w:proofErr w:type="spellStart"/>
+      <w:r>
+        <w:t>technoLab</w:t>
+      </w:r>
+      <w:proofErr w:type="spellEnd"/>
+      <w:r>
+        <w:t xml:space="preserve"> may be used in the project</w:t>
+      </w:r>
+    </w:p>
+    <w:p>
+      <w:pPr>
+        <w:pStyle w:val="ListParagraph"/>
+        <w:numPr>
+          <w:ilvl w:val="0"/>
+          <w:numId w:val="1"/>
+        </w:numPr>
+      </w:pPr>
+      <w:r>
         <w:t>AI may not be used</w:t>
       </w:r>
     </w:p>
@@ -1564,18 +1696,75 @@
     </w:p>
     <w:p>
       <w:r>
-        <w:t>The best 3 projects will all receive prizes(will be determined later what prizes)</w:t>
-      </w:r>
+        <w:t xml:space="preserve">The best 3 projects will all receive </w:t>
+      </w:r>
+      <w:proofErr w:type="gramStart"/>
+      <w:r>
+        <w:t>prizes(</w:t>
+      </w:r>
+      <w:proofErr w:type="gramEnd"/>
+      <w:r>
+        <w:t>will be determined later what prizes)</w:t>
+      </w:r>
+    </w:p>
+    <w:p>
+      <w:r>
+        <w:t>The judges favourite project will receive an additional prize (Whether it be tools implemented or certain pieces of code)</w:t>
+      </w:r>
+    </w:p>
+    <w:p>
+      <w:r>
+        <w:t xml:space="preserve">The project that uses the most “out- of syllabus” tools will get a prize </w:t>
+      </w:r>
+      <w:proofErr w:type="spellStart"/>
+      <w:r>
+        <w:t>aswell</w:t>
+      </w:r>
+      <w:proofErr w:type="spellEnd"/>
+    </w:p>
+    <w:p/>
+    <w:p>
+      <w:pPr>
+        <w:pStyle w:val="Heading1"/>
+      </w:pPr>
     </w:p>
     <w:p>
       <w:pPr>
         <w:pStyle w:val="Heading1"/>
       </w:pPr>
       <w:r>
-        <w:t xml:space="preserve">Hackathon </w:t>
-      </w:r>
-      <w:r>
-        <w:t>Theme</w:t>
+        <w:t>Hackathon Ideas</w:t>
+      </w:r>
+    </w:p>
+    <w:p>
+      <w:pPr>
+        <w:rPr>
+          <w:b/>
+          <w:bCs/>
+        </w:rPr>
+      </w:pPr>
+      <w:r>
+        <w:rPr>
+          <w:b/>
+          <w:bCs/>
+        </w:rPr>
+        <w:t xml:space="preserve">Student can </w:t>
+      </w:r>
+      <w:proofErr w:type="gramStart"/>
+      <w:r>
+        <w:rPr>
+          <w:b/>
+          <w:bCs/>
+        </w:rPr>
+        <w:t>chose</w:t>
+      </w:r>
+      <w:proofErr w:type="gramEnd"/>
+      <w:r>
+        <w:rPr>
+          <w:b/>
+          <w:bCs/>
+        </w:rPr>
+        <w:t xml:space="preserve"> one of the following topics to attempts</w:t>
       </w:r>
     </w:p>
     <w:p>
@@ -1583,62 +1772,94 @@
         <w:pStyle w:val="Heading2"/>
       </w:pPr>
       <w:r>
-        <w:t>Puzzle box</w:t>
+        <w:t>Energy saving house</w:t>
       </w:r>
     </w:p>
     <w:p>
       <w:r>
-        <w:t>Student dev</w:t>
-      </w:r>
-      <w:r>
-        <w:t xml:space="preserve">elop a puzzle box where they set challenges </w:t>
-      </w:r>
-      <w:r>
-        <w:t>and differ</w:t>
-      </w:r>
-      <w:r>
-        <w:t>ent rooms with challenges for the user to solve.</w:t>
-      </w:r>
-    </w:p>
-    <w:p>
-      <w:r>
-        <w:t>The puzzle box should act as an escape room, where once on puzzle is solved a new challenge appears. Students can build a website</w:t>
-      </w:r>
-      <w:r>
-        <w:t xml:space="preserve"> or</w:t>
-      </w:r>
-      <w:r>
-        <w:t xml:space="preserve"> a console App </w:t>
-      </w:r>
-      <w:r>
-        <w:t xml:space="preserve">combined the IOT(Arduino) </w:t>
-      </w:r>
-      <w:r>
-        <w:t>to build this puzzle.</w:t>
-      </w:r>
-      <w:r>
-        <w:t xml:space="preserve"> </w:t>
+        <w:t xml:space="preserve">Sensors should detect how someone is moving around in a house and only switch on the lights in the room with people and 1 surrounding room (if students want to do </w:t>
+      </w:r>
+      <w:proofErr w:type="gramStart"/>
+      <w:r>
+        <w:t>extra</w:t>
+      </w:r>
+      <w:proofErr w:type="gramEnd"/>
+      <w:r>
+        <w:t xml:space="preserve"> they can create a menu to ask how many adjacent rooms should light up to the customer)</w:t>
       </w:r>
     </w:p>
     <w:p/>
     <w:p>
-      <w:r>
-        <w:t xml:space="preserve">Think Keep Talking and nobody explodes, where in the game there is a bomb with different challenges. In the hackathon students will </w:t>
-      </w:r>
-      <w:r>
-        <w:t>create a room setup like the game</w:t>
+      <w:pPr>
+        <w:pStyle w:val="Heading2"/>
+      </w:pPr>
+      <w:r>
+        <w:t>Smart Door Lock</w:t>
       </w:r>
     </w:p>
     <w:p>
       <w:r>
-        <w:t xml:space="preserve">Students can build a console app, </w:t>
-      </w:r>
-      <w:r>
-        <w:t xml:space="preserve">website and/or </w:t>
-      </w:r>
-      <w:r>
-        <w:t>use IOT such as Arduino chips</w:t>
-      </w:r>
+        <w:t xml:space="preserve">A sensor should detect when a user approaches a door and </w:t>
+      </w:r>
+      <w:proofErr w:type="gramStart"/>
+      <w:r>
+        <w:t>start</w:t>
+      </w:r>
+      <w:proofErr w:type="gramEnd"/>
+      <w:r>
+        <w:t xml:space="preserve"> a “login” process which includes:</w:t>
+      </w:r>
+      <w:r>
+        <w:br/>
+        <w:t>1. Monitoring how the user walks (optional)</w:t>
+      </w:r>
+    </w:p>
+    <w:p>
+      <w:r>
+        <w:t>2. Voice recognition</w:t>
+      </w:r>
+    </w:p>
+    <w:p>
+      <w:r>
+        <w:t>3. Fingerprints (as the touch the door handle)</w:t>
+      </w:r>
+    </w:p>
+    <w:p>
+      <w:r>
+        <w:t xml:space="preserve">4. </w:t>
+      </w:r>
+      <w:proofErr w:type="spellStart"/>
+      <w:r>
+        <w:t>Retna</w:t>
+      </w:r>
+      <w:proofErr w:type="spellEnd"/>
+      <w:r>
+        <w:t xml:space="preserve"> Scanner</w:t>
+      </w:r>
+    </w:p>
+    <w:p/>
+    <w:p>
+      <w:pPr>
+        <w:pStyle w:val="Heading2"/>
+      </w:pPr>
+      <w:r>
+        <w:t>Smart Parking</w:t>
+      </w:r>
+    </w:p>
+    <w:p>
+      <w:r>
+        <w:t xml:space="preserve">Students should build a system to help customers find parking, this could include a system where each parking bay has a sensor and when the users enter the parking lot an LED pathway </w:t>
+      </w:r>
+      <w:r>
+        <w:lastRenderedPageBreak/>
+        <w:t>appears in the road guiding them to the designated parking (a system could be used that when a customer steals a parking spot for some reason, a new route should appear)</w:t>
+      </w:r>
+    </w:p>
+    <w:p/>
+    <w:p>
+      <w:pPr>
+        <w:pStyle w:val="Heading2"/>
+      </w:pPr>
     </w:p>
     <w:p/>
     <w:sectPr>

</xml_diff>